<commit_message>
docs(install): 同步 0.9.0 安装 DOCX、Release 说明与检查单（#335）
</commit_message>
<xml_diff>
--- a/docs/安装说明-发给使用者.docx
+++ b/docs/安装说明-发给使用者.docx
@@ -12,7 +12,7 @@
           <w:color w:val="1F3764"/>
           <w:sz w:val="40"/>
         </w:rPr>
-        <w:t>场景通 0.2.1 安装说明</w:t>
+        <w:t>场景通 0.9.0 安装说明</w:t>
       </w:r>
     </w:p>
     <w:p>
@@ -152,7 +152,7 @@
                 <w:color w:val="B03060"/>
                 <w:sz w:val="19"/>
               </w:rPr>
-              <w:t>SceneMaster-0.2.1-mac-arm64.dmg</w:t>
+              <w:t>SceneMaster-0.9.0-mac-arm64.dmg</w:t>
             </w:r>
           </w:p>
         </w:tc>
@@ -193,7 +193,7 @@
                 <w:color w:val="B03060"/>
                 <w:sz w:val="19"/>
               </w:rPr>
-              <w:t>SceneMaster-0.2.1-win-x64-setup.exe</w:t>
+              <w:t>SceneMaster-0.9.0-win-x64-setup.exe</w:t>
             </w:r>
             <w:r>
               <w:rPr>
@@ -223,7 +223,7 @@
                 <w:color w:val="B03060"/>
                 <w:sz w:val="19"/>
               </w:rPr>
-              <w:t>SceneMaster-0.2.1-win-x64-portable.exe</w:t>
+              <w:t>SceneMaster-0.9.0-win-x64-portable.exe</w:t>
             </w:r>
             <w:r>
               <w:rPr>
@@ -388,6 +388,14 @@
         <w:pStyle w:val="ListBullet"/>
       </w:pPr>
       <w:r>
+        <w:t>先把安装包移到「下载」或「桌面」等普通目录再双击。不要在 DeepSeek Harness 工作区、公司管控/加密目录里直接运行：这类目录会给 exe 打「低完整性」标签，Windows 拒绝执行，表现是双击毫无反应、也不报错。</w:t>
+      </w:r>
+    </w:p>
+    <w:p>
+      <w:pPr>
+        <w:pStyle w:val="ListBullet"/>
+      </w:pPr>
+      <w:r>
         <w:rPr>
           <w:rFonts w:ascii="微软雅黑" w:hAnsi="微软雅黑" w:eastAsia="微软雅黑"/>
           <w:b/>
@@ -448,6 +456,14 @@
           <w:b/>
         </w:rPr>
         <w:t>更多信息 → 仍要运行</w:t>
+      </w:r>
+    </w:p>
+    <w:p>
+      <w:pPr>
+        <w:pStyle w:val="ListBullet"/>
+      </w:pPr>
+      <w:r>
+        <w:t>如果双击后长时间没反应、也没有弹窗：右键安装包 →「属性」→ 勾选「解除锁定」→ 确定，再双击。</w:t>
       </w:r>
     </w:p>
     <w:p>
@@ -722,7 +738,7 @@
         <w:rPr>
           <w:rFonts w:ascii="微软雅黑" w:hAnsi="微软雅黑" w:eastAsia="微软雅黑"/>
         </w:rPr>
-        <w:t xml:space="preserve"> → 客户材料入库 → 对话把场景定义清楚 → 按 7 步推进 → 最后在「交付物」导出 Word / PPT / Markdown</w:t>
+        <w:t xml:space="preserve"> → 客户材料入库 → 对话把场景定义清楚 → 按 6 步推进 → 最后在「交付物」导出 Word / PPT / Markdown</w:t>
       </w:r>
     </w:p>
     <w:p>

</xml_diff>

<commit_message>
chore: 停止发布 Windows portable，仅保留 setup（#337）
</commit_message>
<xml_diff>
--- a/docs/安装说明-发给使用者.docx
+++ b/docs/安装说明-发给使用者.docx
@@ -183,54 +183,7 @@
           </w:tcPr>
           <w:p>
             <w:r>
-              <w:rPr>
-                <w:sz w:val="19"/>
-              </w:rPr>
-            </w:r>
-            <w:r>
-              <w:rPr>
-                <w:rFonts w:ascii="Consolas" w:hAnsi="Consolas"/>
-                <w:color w:val="B03060"/>
-                <w:sz w:val="19"/>
-              </w:rPr>
-              <w:t>SceneMaster-0.9.1-win-x64-setup.exe</w:t>
-            </w:r>
-            <w:r>
-              <w:rPr>
-                <w:rFonts w:ascii="微软雅黑" w:hAnsi="微软雅黑" w:eastAsia="微软雅黑"/>
-                <w:sz w:val="19"/>
-              </w:rPr>
-              <w:t>（</w:t>
-            </w:r>
-            <w:r>
-              <w:rPr>
-                <w:rFonts w:ascii="微软雅黑" w:hAnsi="微软雅黑" w:eastAsia="微软雅黑"/>
-                <w:b/>
-                <w:sz w:val="19"/>
-              </w:rPr>
-              <w:t>安装版，推荐</w:t>
-            </w:r>
-            <w:r>
-              <w:rPr>
-                <w:rFonts w:ascii="微软雅黑" w:hAnsi="微软雅黑" w:eastAsia="微软雅黑"/>
-                <w:sz w:val="19"/>
-              </w:rPr>
-              <w:t xml:space="preserve">） / 或 </w:t>
-            </w:r>
-            <w:r>
-              <w:rPr>
-                <w:rFonts w:ascii="Consolas" w:hAnsi="Consolas"/>
-                <w:color w:val="B03060"/>
-                <w:sz w:val="19"/>
-              </w:rPr>
-              <w:t>SceneMaster-0.9.1-win-x64-portable.exe</w:t>
-            </w:r>
-            <w:r>
-              <w:rPr>
-                <w:rFonts w:ascii="微软雅黑" w:hAnsi="微软雅黑" w:eastAsia="微软雅黑"/>
-                <w:sz w:val="19"/>
-              </w:rPr>
-              <w:t>（免安装，解压即用）</w:t>
+              <w:t>SceneMaster-0.9.1-win-x64-setup.exe（安装版）</w:t>
             </w:r>
           </w:p>
         </w:tc>
@@ -407,24 +360,6 @@
           <w:rFonts w:ascii="微软雅黑" w:hAnsi="微软雅黑" w:eastAsia="微软雅黑"/>
         </w:rPr>
         <w:t>：双击一路「下一步」装完</w:t>
-      </w:r>
-    </w:p>
-    <w:p>
-      <w:pPr>
-        <w:pStyle w:val="ListBullet"/>
-      </w:pPr>
-      <w:r>
-        <w:rPr>
-          <w:rFonts w:ascii="微软雅黑" w:hAnsi="微软雅黑" w:eastAsia="微软雅黑"/>
-          <w:b/>
-        </w:rPr>
-        <w:t>免安装版（portable）</w:t>
-      </w:r>
-      <w:r>
-        <w:rPr>
-          <w:rFonts w:ascii="微软雅黑" w:hAnsi="微软雅黑" w:eastAsia="微软雅黑"/>
-        </w:rPr>
-        <w:t>：解压到任意文件夹，双击里面的 exe 直接用</w:t>
       </w:r>
     </w:p>
     <w:p>

</xml_diff>

<commit_message>
feat: Windows 安装包内置 PPT 组件，升 0.9.2（#340）
</commit_message>
<xml_diff>
--- a/docs/安装说明-发给使用者.docx
+++ b/docs/安装说明-发给使用者.docx
@@ -12,7 +12,7 @@
           <w:color w:val="1F3764"/>
           <w:sz w:val="40"/>
         </w:rPr>
-        <w:t>场景通 0.9.1 安装说明</w:t>
+        <w:t>场景通 0.9.2 安装说明</w:t>
       </w:r>
     </w:p>
     <w:p>
@@ -152,7 +152,7 @@
                 <w:color w:val="B03060"/>
                 <w:sz w:val="19"/>
               </w:rPr>
-              <w:t>SceneMaster-0.9.1-mac-arm64.dmg</w:t>
+              <w:t>SceneMaster-0.9.2-mac-arm64.dmg</w:t>
             </w:r>
           </w:p>
         </w:tc>
@@ -183,7 +183,7 @@
           </w:tcPr>
           <w:p>
             <w:r>
-              <w:t>SceneMaster-0.9.1-win-x64-setup.exe（安装版）</w:t>
+              <w:t>SceneMaster-0.9.2-win-x64-setup.exe（安装版）</w:t>
             </w:r>
           </w:p>
         </w:tc>

</xml_diff>